<commit_message>
Fiche Word réservée à l'admin ; photos et mot de passe par WhatsApp
- La fiche ne se télécharge plus que depuis Admin → Import de fichiers
  (lien retiré de la page d'attente).
- Fiche : plus de cases photos ; le membre envoie ses 3 photos séparément
  sur WhatsApp (+237 620 51 41 42) et est prévenu qu'un admin lui enverra
  son mot de passe une fois le compte créé. Tient sur une page.
- Import de fichiers : si l'e-mail de la fiche n'a pas de compte, l'admin le
  crée (POST /api/admin/photos, compte « en attente ») ; un mot de passe
  provisoire est affiché une fois, avec un message WhatsApp prêt à envoyer.

Co-Authored-By: Claude Sonnet 5.5 <noreply@anthropic.com>
Claude-Session: https://claude.ai/code/session_01FK7Eey5X6CSAiP16kqVTqg
</commit_message>
<xml_diff>
--- a/public/formulaires/fiche-inscription-garden-of-alliance.docx
+++ b/public/formulaires/fiche-inscription-garden-of-alliance.docx
@@ -41,7 +41,7 @@
         <w:spacing w:after="120"/>
       </w:pPr>
       <w:r>
-        <w:t xml:space="preserve">Vous avez créé votre compte mais n'arrivez pas à terminer votre inscription (photos, informations) ? Remplissez cette fiche : notre équipe complétera votre profil pour vous.</w:t>
+        <w:t xml:space="preserve">Vous n'arrivez pas à vous inscrire en ligne ? Remplissez cette fiche : notre équipe créera votre compte et complétera votre profil pour vous.</w:t>
       </w:r>
     </w:p>
     <w:p>
@@ -67,7 +67,7 @@
         <w:spacing w:after="80"/>
       </w:pPr>
       <w:r>
-        <w:t xml:space="preserve">Collez vos 3 photos dans les cases prévues (Insertion › Image), visage bien visible, sans filtre.</w:t>
+        <w:t xml:space="preserve">N'ajoutez PAS vos photos dans ce document : envoyez-les séparément sur WhatsApp (étape 4).</w:t>
       </w:r>
     </w:p>
     <w:p>
@@ -86,7 +86,7 @@
     <w:p>
       <w:pPr>
         <w:pStyle w:val="Heading2"/>
-        <w:spacing w:after="140" w:before="300"/>
+        <w:spacing w:after="100" w:before="200"/>
       </w:pPr>
       <w:r>
         <w:rPr>
@@ -127,9 +127,9 @@
             </w:tcBorders>
             <w:shd w:fill="EEF3EC" w:color="auto" w:val="clear"/>
             <w:tcMar>
-              <w:top w:type="dxa" w:w="100"/>
-              <w:left w:type="dxa" w:w="140"/>
-              <w:bottom w:type="dxa" w:w="100"/>
+              <w:top w:type="dxa" w:w="70"/>
+              <w:left w:type="dxa" w:w="140"/>
+              <w:bottom w:type="dxa" w:w="70"/>
               <w:right w:type="dxa" w:w="140"/>
             </w:tcMar>
             <w:vAlign w:val="center"/>
@@ -155,7 +155,7 @@
                 <w:sz w:val="16"/>
                 <w:szCs w:val="16"/>
               </w:rPr>
-              <w:t xml:space="preserve">Celle utilisée pour créer votre compte (obligatoire)</w:t>
+              <w:t xml:space="preserve">Celle de votre futur compte (obligatoire)</w:t>
             </w:r>
           </w:p>
         </w:tc>
@@ -169,9 +169,9 @@
               <w:right w:val="single" w:color="C9D3C7" w:sz="4"/>
             </w:tcBorders>
             <w:tcMar>
-              <w:top w:type="dxa" w:w="100"/>
-              <w:left w:type="dxa" w:w="140"/>
-              <w:bottom w:type="dxa" w:w="100"/>
+              <w:top w:type="dxa" w:w="70"/>
+              <w:left w:type="dxa" w:w="140"/>
+              <w:bottom w:type="dxa" w:w="70"/>
               <w:right w:type="dxa" w:w="140"/>
             </w:tcMar>
             <w:vAlign w:val="center"/>
@@ -191,7 +191,7 @@
     <w:p>
       <w:pPr>
         <w:pStyle w:val="Heading2"/>
-        <w:spacing w:after="140" w:before="300"/>
+        <w:spacing w:after="100" w:before="200"/>
       </w:pPr>
       <w:r>
         <w:rPr>
@@ -232,9 +232,9 @@
             </w:tcBorders>
             <w:shd w:fill="EEF3EC" w:color="auto" w:val="clear"/>
             <w:tcMar>
-              <w:top w:type="dxa" w:w="100"/>
-              <w:left w:type="dxa" w:w="140"/>
-              <w:bottom w:type="dxa" w:w="100"/>
+              <w:top w:type="dxa" w:w="70"/>
+              <w:left w:type="dxa" w:w="140"/>
+              <w:bottom w:type="dxa" w:w="70"/>
               <w:right w:type="dxa" w:w="140"/>
             </w:tcMar>
             <w:vAlign w:val="center"/>
@@ -274,9 +274,9 @@
               <w:right w:val="single" w:color="C9D3C7" w:sz="4"/>
             </w:tcBorders>
             <w:tcMar>
-              <w:top w:type="dxa" w:w="100"/>
-              <w:left w:type="dxa" w:w="140"/>
-              <w:bottom w:type="dxa" w:w="100"/>
+              <w:top w:type="dxa" w:w="70"/>
+              <w:left w:type="dxa" w:w="140"/>
+              <w:bottom w:type="dxa" w:w="70"/>
               <w:right w:type="dxa" w:w="140"/>
             </w:tcMar>
             <w:vAlign w:val="center"/>
@@ -304,9 +304,9 @@
             </w:tcBorders>
             <w:shd w:fill="EEF3EC" w:color="auto" w:val="clear"/>
             <w:tcMar>
-              <w:top w:type="dxa" w:w="100"/>
-              <w:left w:type="dxa" w:w="140"/>
-              <w:bottom w:type="dxa" w:w="100"/>
+              <w:top w:type="dxa" w:w="70"/>
+              <w:left w:type="dxa" w:w="140"/>
+              <w:bottom w:type="dxa" w:w="70"/>
               <w:right w:type="dxa" w:w="140"/>
             </w:tcMar>
             <w:vAlign w:val="center"/>
@@ -334,9 +334,9 @@
               <w:right w:val="single" w:color="C9D3C7" w:sz="4"/>
             </w:tcBorders>
             <w:tcMar>
-              <w:top w:type="dxa" w:w="100"/>
-              <w:left w:type="dxa" w:w="140"/>
-              <w:bottom w:type="dxa" w:w="100"/>
+              <w:top w:type="dxa" w:w="70"/>
+              <w:left w:type="dxa" w:w="140"/>
+              <w:bottom w:type="dxa" w:w="70"/>
               <w:right w:type="dxa" w:w="140"/>
             </w:tcMar>
             <w:vAlign w:val="center"/>
@@ -364,9 +364,9 @@
             </w:tcBorders>
             <w:shd w:fill="EEF3EC" w:color="auto" w:val="clear"/>
             <w:tcMar>
-              <w:top w:type="dxa" w:w="100"/>
-              <w:left w:type="dxa" w:w="140"/>
-              <w:bottom w:type="dxa" w:w="100"/>
+              <w:top w:type="dxa" w:w="70"/>
+              <w:left w:type="dxa" w:w="140"/>
+              <w:bottom w:type="dxa" w:w="70"/>
               <w:right w:type="dxa" w:w="140"/>
             </w:tcMar>
             <w:vAlign w:val="center"/>
@@ -394,9 +394,9 @@
               <w:right w:val="single" w:color="C9D3C7" w:sz="4"/>
             </w:tcBorders>
             <w:tcMar>
-              <w:top w:type="dxa" w:w="100"/>
-              <w:left w:type="dxa" w:w="140"/>
-              <w:bottom w:type="dxa" w:w="100"/>
+              <w:top w:type="dxa" w:w="70"/>
+              <w:left w:type="dxa" w:w="140"/>
+              <w:bottom w:type="dxa" w:w="70"/>
               <w:right w:type="dxa" w:w="140"/>
             </w:tcMar>
             <w:vAlign w:val="center"/>
@@ -424,9 +424,9 @@
             </w:tcBorders>
             <w:shd w:fill="EEF3EC" w:color="auto" w:val="clear"/>
             <w:tcMar>
-              <w:top w:type="dxa" w:w="100"/>
-              <w:left w:type="dxa" w:w="140"/>
-              <w:bottom w:type="dxa" w:w="100"/>
+              <w:top w:type="dxa" w:w="70"/>
+              <w:left w:type="dxa" w:w="140"/>
+              <w:bottom w:type="dxa" w:w="70"/>
               <w:right w:type="dxa" w:w="140"/>
             </w:tcMar>
             <w:vAlign w:val="center"/>
@@ -466,9 +466,9 @@
               <w:right w:val="single" w:color="C9D3C7" w:sz="4"/>
             </w:tcBorders>
             <w:tcMar>
-              <w:top w:type="dxa" w:w="100"/>
-              <w:left w:type="dxa" w:w="140"/>
-              <w:bottom w:type="dxa" w:w="100"/>
+              <w:top w:type="dxa" w:w="70"/>
+              <w:left w:type="dxa" w:w="140"/>
+              <w:bottom w:type="dxa" w:w="70"/>
               <w:right w:type="dxa" w:w="140"/>
             </w:tcMar>
             <w:vAlign w:val="center"/>
@@ -496,9 +496,9 @@
             </w:tcBorders>
             <w:shd w:fill="EEF3EC" w:color="auto" w:val="clear"/>
             <w:tcMar>
-              <w:top w:type="dxa" w:w="100"/>
-              <w:left w:type="dxa" w:w="140"/>
-              <w:bottom w:type="dxa" w:w="100"/>
+              <w:top w:type="dxa" w:w="70"/>
+              <w:left w:type="dxa" w:w="140"/>
+              <w:bottom w:type="dxa" w:w="70"/>
               <w:right w:type="dxa" w:w="140"/>
             </w:tcMar>
             <w:vAlign w:val="center"/>
@@ -538,9 +538,9 @@
               <w:right w:val="single" w:color="C9D3C7" w:sz="4"/>
             </w:tcBorders>
             <w:tcMar>
-              <w:top w:type="dxa" w:w="100"/>
-              <w:left w:type="dxa" w:w="140"/>
-              <w:bottom w:type="dxa" w:w="100"/>
+              <w:top w:type="dxa" w:w="70"/>
+              <w:left w:type="dxa" w:w="140"/>
+              <w:bottom w:type="dxa" w:w="70"/>
               <w:right w:type="dxa" w:w="140"/>
             </w:tcMar>
             <w:vAlign w:val="center"/>
@@ -568,9 +568,9 @@
             </w:tcBorders>
             <w:shd w:fill="EEF3EC" w:color="auto" w:val="clear"/>
             <w:tcMar>
-              <w:top w:type="dxa" w:w="100"/>
-              <w:left w:type="dxa" w:w="140"/>
-              <w:bottom w:type="dxa" w:w="100"/>
+              <w:top w:type="dxa" w:w="70"/>
+              <w:left w:type="dxa" w:w="140"/>
+              <w:bottom w:type="dxa" w:w="70"/>
               <w:right w:type="dxa" w:w="140"/>
             </w:tcMar>
             <w:vAlign w:val="center"/>
@@ -610,9 +610,9 @@
               <w:right w:val="single" w:color="C9D3C7" w:sz="4"/>
             </w:tcBorders>
             <w:tcMar>
-              <w:top w:type="dxa" w:w="100"/>
-              <w:left w:type="dxa" w:w="140"/>
-              <w:bottom w:type="dxa" w:w="100"/>
+              <w:top w:type="dxa" w:w="70"/>
+              <w:left w:type="dxa" w:w="140"/>
+              <w:bottom w:type="dxa" w:w="70"/>
               <w:right w:type="dxa" w:w="140"/>
             </w:tcMar>
             <w:vAlign w:val="center"/>
@@ -632,7 +632,7 @@
     <w:p>
       <w:pPr>
         <w:pStyle w:val="Heading2"/>
-        <w:spacing w:after="140" w:before="300"/>
+        <w:spacing w:after="100" w:before="200"/>
       </w:pPr>
       <w:r>
         <w:rPr>
@@ -673,9 +673,9 @@
             </w:tcBorders>
             <w:shd w:fill="EEF3EC" w:color="auto" w:val="clear"/>
             <w:tcMar>
-              <w:top w:type="dxa" w:w="100"/>
-              <w:left w:type="dxa" w:w="140"/>
-              <w:bottom w:type="dxa" w:w="100"/>
+              <w:top w:type="dxa" w:w="70"/>
+              <w:left w:type="dxa" w:w="140"/>
+              <w:bottom w:type="dxa" w:w="70"/>
               <w:right w:type="dxa" w:w="140"/>
             </w:tcMar>
             <w:vAlign w:val="center"/>
@@ -715,9 +715,9 @@
               <w:right w:val="single" w:color="C9D3C7" w:sz="4"/>
             </w:tcBorders>
             <w:tcMar>
-              <w:top w:type="dxa" w:w="100"/>
-              <w:left w:type="dxa" w:w="140"/>
-              <w:bottom w:type="dxa" w:w="100"/>
+              <w:top w:type="dxa" w:w="70"/>
+              <w:left w:type="dxa" w:w="140"/>
+              <w:bottom w:type="dxa" w:w="70"/>
               <w:right w:type="dxa" w:w="140"/>
             </w:tcMar>
             <w:vAlign w:val="center"/>
@@ -745,9 +745,9 @@
             </w:tcBorders>
             <w:shd w:fill="EEF3EC" w:color="auto" w:val="clear"/>
             <w:tcMar>
-              <w:top w:type="dxa" w:w="100"/>
-              <w:left w:type="dxa" w:w="140"/>
-              <w:bottom w:type="dxa" w:w="100"/>
+              <w:top w:type="dxa" w:w="70"/>
+              <w:left w:type="dxa" w:w="140"/>
+              <w:bottom w:type="dxa" w:w="70"/>
               <w:right w:type="dxa" w:w="140"/>
             </w:tcMar>
             <w:vAlign w:val="center"/>
@@ -787,9 +787,9 @@
               <w:right w:val="single" w:color="C9D3C7" w:sz="4"/>
             </w:tcBorders>
             <w:tcMar>
-              <w:top w:type="dxa" w:w="100"/>
-              <w:left w:type="dxa" w:w="140"/>
-              <w:bottom w:type="dxa" w:w="100"/>
+              <w:top w:type="dxa" w:w="70"/>
+              <w:left w:type="dxa" w:w="140"/>
+              <w:bottom w:type="dxa" w:w="70"/>
               <w:right w:type="dxa" w:w="140"/>
             </w:tcMar>
             <w:vAlign w:val="center"/>
@@ -817,9 +817,9 @@
             </w:tcBorders>
             <w:shd w:fill="EEF3EC" w:color="auto" w:val="clear"/>
             <w:tcMar>
-              <w:top w:type="dxa" w:w="100"/>
-              <w:left w:type="dxa" w:w="140"/>
-              <w:bottom w:type="dxa" w:w="100"/>
+              <w:top w:type="dxa" w:w="70"/>
+              <w:left w:type="dxa" w:w="140"/>
+              <w:bottom w:type="dxa" w:w="70"/>
               <w:right w:type="dxa" w:w="140"/>
             </w:tcMar>
             <w:vAlign w:val="center"/>
@@ -859,9 +859,9 @@
               <w:right w:val="single" w:color="C9D3C7" w:sz="4"/>
             </w:tcBorders>
             <w:tcMar>
-              <w:top w:type="dxa" w:w="100"/>
-              <w:left w:type="dxa" w:w="140"/>
-              <w:bottom w:type="dxa" w:w="100"/>
+              <w:top w:type="dxa" w:w="70"/>
+              <w:left w:type="dxa" w:w="140"/>
+              <w:bottom w:type="dxa" w:w="70"/>
               <w:right w:type="dxa" w:w="140"/>
             </w:tcMar>
             <w:vAlign w:val="center"/>
@@ -889,9 +889,9 @@
             </w:tcBorders>
             <w:shd w:fill="EEF3EC" w:color="auto" w:val="clear"/>
             <w:tcMar>
-              <w:top w:type="dxa" w:w="100"/>
-              <w:left w:type="dxa" w:w="140"/>
-              <w:bottom w:type="dxa" w:w="100"/>
+              <w:top w:type="dxa" w:w="70"/>
+              <w:left w:type="dxa" w:w="140"/>
+              <w:bottom w:type="dxa" w:w="70"/>
               <w:right w:type="dxa" w:w="140"/>
             </w:tcMar>
             <w:vAlign w:val="center"/>
@@ -931,9 +931,9 @@
               <w:right w:val="single" w:color="C9D3C7" w:sz="4"/>
             </w:tcBorders>
             <w:tcMar>
-              <w:top w:type="dxa" w:w="100"/>
-              <w:left w:type="dxa" w:w="140"/>
-              <w:bottom w:type="dxa" w:w="100"/>
+              <w:top w:type="dxa" w:w="70"/>
+              <w:left w:type="dxa" w:w="140"/>
+              <w:bottom w:type="dxa" w:w="70"/>
               <w:right w:type="dxa" w:w="140"/>
             </w:tcMar>
             <w:vAlign w:val="center"/>
@@ -961,9 +961,9 @@
             </w:tcBorders>
             <w:shd w:fill="EEF3EC" w:color="auto" w:val="clear"/>
             <w:tcMar>
-              <w:top w:type="dxa" w:w="100"/>
-              <w:left w:type="dxa" w:w="140"/>
-              <w:bottom w:type="dxa" w:w="100"/>
+              <w:top w:type="dxa" w:w="70"/>
+              <w:left w:type="dxa" w:w="140"/>
+              <w:bottom w:type="dxa" w:w="70"/>
               <w:right w:type="dxa" w:w="140"/>
             </w:tcMar>
             <w:vAlign w:val="center"/>
@@ -1003,9 +1003,9 @@
               <w:right w:val="single" w:color="C9D3C7" w:sz="4"/>
             </w:tcBorders>
             <w:tcMar>
-              <w:top w:type="dxa" w:w="100"/>
-              <w:left w:type="dxa" w:w="140"/>
-              <w:bottom w:type="dxa" w:w="100"/>
+              <w:top w:type="dxa" w:w="70"/>
+              <w:left w:type="dxa" w:w="140"/>
+              <w:bottom w:type="dxa" w:w="70"/>
               <w:right w:type="dxa" w:w="140"/>
             </w:tcMar>
             <w:vAlign w:val="center"/>
@@ -1024,13 +1024,8 @@
     </w:tbl>
     <w:p>
       <w:pPr>
-        <w:pageBreakBefore/>
-      </w:pPr>
-    </w:p>
-    <w:p>
-      <w:pPr>
         <w:pStyle w:val="Heading2"/>
-        <w:spacing w:after="140" w:before="300"/>
+        <w:spacing w:after="100" w:before="200"/>
       </w:pPr>
       <w:r>
         <w:rPr>
@@ -1040,236 +1035,21 @@
           <w:sz w:val="26"/>
           <w:szCs w:val="26"/>
         </w:rPr>
-        <w:t xml:space="preserve">4. Vos photos</w:t>
+        <w:t xml:space="preserve">4. Vos photos — à envoyer sur WhatsApp</w:t>
       </w:r>
     </w:p>
     <w:p>
       <w:pPr>
         <w:spacing w:after="120"/>
-        <w:rPr>
-          <w:color w:val="6B7280"/>
-          <w:sz w:val="18"/>
-          <w:szCs w:val="18"/>
-        </w:rPr>
-      </w:pPr>
-      <w:r>
-        <w:rPr>
-          <w:color w:val="6B7280"/>
-          <w:sz w:val="18"/>
-          <w:szCs w:val="18"/>
-        </w:rPr>
-        <w:t xml:space="preserve">Trois photos récentes de vous, seul(e), visage bien visible. Elles restent privées jusqu'à la validation de votre profil.</w:t>
-      </w:r>
-    </w:p>
-    <w:tbl>
-      <w:tblPr>
-        <w:tblW w:type="dxa" w:w="9636"/>
-        <w:tblBorders>
-          <w:top w:val="single" w:color="auto" w:sz="4"/>
-          <w:left w:val="single" w:color="auto" w:sz="4"/>
-          <w:bottom w:val="single" w:color="auto" w:sz="4"/>
-          <w:right w:val="single" w:color="auto" w:sz="4"/>
-          <w:insideH w:val="single" w:color="auto" w:sz="4"/>
-          <w:insideV w:val="single" w:color="auto" w:sz="4"/>
-        </w:tblBorders>
-      </w:tblPr>
-      <w:tblGrid>
-        <w:gridCol w:w="3212"/>
-        <w:gridCol w:w="3212"/>
-        <w:gridCol w:w="3212"/>
-      </w:tblGrid>
-      <w:tr>
-        <w:tc>
-          <w:tcPr>
-            <w:tcW w:type="dxa" w:w="3212"/>
-            <w:tcBorders>
-              <w:top w:val="single" w:color="C9D3C7" w:sz="4"/>
-              <w:left w:val="single" w:color="C9D3C7" w:sz="4"/>
-              <w:bottom w:val="single" w:color="C9D3C7" w:sz="4"/>
-              <w:right w:val="single" w:color="C9D3C7" w:sz="4"/>
-            </w:tcBorders>
-            <w:shd w:fill="EEF3EC" w:color="auto" w:val="clear"/>
-            <w:tcMar>
-              <w:top w:type="dxa" w:w="80"/>
-              <w:left w:type="dxa" w:w="100"/>
-              <w:bottom w:type="dxa" w:w="80"/>
-              <w:right w:type="dxa" w:w="100"/>
-            </w:tcMar>
-          </w:tcPr>
-          <w:p>
-            <w:pPr>
-              <w:jc w:val="center"/>
-            </w:pPr>
-            <w:r>
-              <w:rPr>
-                <w:b/>
-                <w:bCs/>
-                <w:color w:val="2E4A36"/>
-                <w:sz w:val="20"/>
-                <w:szCs w:val="20"/>
-              </w:rPr>
-              <w:t xml:space="preserve">Photo 1 — visage</w:t>
-            </w:r>
-          </w:p>
-        </w:tc>
-        <w:tc>
-          <w:tcPr>
-            <w:tcW w:type="dxa" w:w="3212"/>
-            <w:tcBorders>
-              <w:top w:val="single" w:color="C9D3C7" w:sz="4"/>
-              <w:left w:val="single" w:color="C9D3C7" w:sz="4"/>
-              <w:bottom w:val="single" w:color="C9D3C7" w:sz="4"/>
-              <w:right w:val="single" w:color="C9D3C7" w:sz="4"/>
-            </w:tcBorders>
-            <w:shd w:fill="EEF3EC" w:color="auto" w:val="clear"/>
-            <w:tcMar>
-              <w:top w:type="dxa" w:w="80"/>
-              <w:left w:type="dxa" w:w="100"/>
-              <w:bottom w:type="dxa" w:w="80"/>
-              <w:right w:type="dxa" w:w="100"/>
-            </w:tcMar>
-          </w:tcPr>
-          <w:p>
-            <w:pPr>
-              <w:jc w:val="center"/>
-            </w:pPr>
-            <w:r>
-              <w:rPr>
-                <w:b/>
-                <w:bCs/>
-                <w:color w:val="2E4A36"/>
-                <w:sz w:val="20"/>
-                <w:szCs w:val="20"/>
-              </w:rPr>
-              <w:t xml:space="preserve">Photo 2</w:t>
-            </w:r>
-          </w:p>
-        </w:tc>
-        <w:tc>
-          <w:tcPr>
-            <w:tcW w:type="dxa" w:w="3212"/>
-            <w:tcBorders>
-              <w:top w:val="single" w:color="C9D3C7" w:sz="4"/>
-              <w:left w:val="single" w:color="C9D3C7" w:sz="4"/>
-              <w:bottom w:val="single" w:color="C9D3C7" w:sz="4"/>
-              <w:right w:val="single" w:color="C9D3C7" w:sz="4"/>
-            </w:tcBorders>
-            <w:shd w:fill="EEF3EC" w:color="auto" w:val="clear"/>
-            <w:tcMar>
-              <w:top w:type="dxa" w:w="80"/>
-              <w:left w:type="dxa" w:w="100"/>
-              <w:bottom w:type="dxa" w:w="80"/>
-              <w:right w:type="dxa" w:w="100"/>
-            </w:tcMar>
-          </w:tcPr>
-          <w:p>
-            <w:pPr>
-              <w:jc w:val="center"/>
-            </w:pPr>
-            <w:r>
-              <w:rPr>
-                <w:b/>
-                <w:bCs/>
-                <w:color w:val="2E4A36"/>
-                <w:sz w:val="20"/>
-                <w:szCs w:val="20"/>
-              </w:rPr>
-              <w:t xml:space="preserve">Photo 3</w:t>
-            </w:r>
-          </w:p>
-        </w:tc>
-      </w:tr>
-      <w:tr>
-        <w:trPr>
-          <w:trHeight w:val="3400" w:hRule="atLeast"/>
-        </w:trPr>
-        <w:tc>
-          <w:tcPr>
-            <w:tcW w:type="dxa" w:w="3212"/>
-            <w:tcBorders>
-              <w:top w:val="single" w:color="C9D3C7" w:sz="4"/>
-              <w:left w:val="single" w:color="C9D3C7" w:sz="4"/>
-              <w:bottom w:val="single" w:color="C9D3C7" w:sz="4"/>
-              <w:right w:val="single" w:color="C9D3C7" w:sz="4"/>
-            </w:tcBorders>
-            <w:vAlign w:val="center"/>
-          </w:tcPr>
-          <w:p>
-            <w:pPr>
-              <w:jc w:val="center"/>
-            </w:pPr>
-            <w:r>
-              <w:rPr>
-                <w:i/>
-                <w:iCs/>
-                <w:color w:val="6B7280"/>
-                <w:sz w:val="16"/>
-                <w:szCs w:val="16"/>
-              </w:rPr>
-              <w:t xml:space="preserve">Collez votre photo ici</w:t>
-            </w:r>
-          </w:p>
-        </w:tc>
-        <w:tc>
-          <w:tcPr>
-            <w:tcW w:type="dxa" w:w="3212"/>
-            <w:tcBorders>
-              <w:top w:val="single" w:color="C9D3C7" w:sz="4"/>
-              <w:left w:val="single" w:color="C9D3C7" w:sz="4"/>
-              <w:bottom w:val="single" w:color="C9D3C7" w:sz="4"/>
-              <w:right w:val="single" w:color="C9D3C7" w:sz="4"/>
-            </w:tcBorders>
-            <w:vAlign w:val="center"/>
-          </w:tcPr>
-          <w:p>
-            <w:pPr>
-              <w:jc w:val="center"/>
-            </w:pPr>
-            <w:r>
-              <w:rPr>
-                <w:i/>
-                <w:iCs/>
-                <w:color w:val="6B7280"/>
-                <w:sz w:val="16"/>
-                <w:szCs w:val="16"/>
-              </w:rPr>
-              <w:t xml:space="preserve">Collez votre photo ici</w:t>
-            </w:r>
-          </w:p>
-        </w:tc>
-        <w:tc>
-          <w:tcPr>
-            <w:tcW w:type="dxa" w:w="3212"/>
-            <w:tcBorders>
-              <w:top w:val="single" w:color="C9D3C7" w:sz="4"/>
-              <w:left w:val="single" w:color="C9D3C7" w:sz="4"/>
-              <w:bottom w:val="single" w:color="C9D3C7" w:sz="4"/>
-              <w:right w:val="single" w:color="C9D3C7" w:sz="4"/>
-            </w:tcBorders>
-            <w:vAlign w:val="center"/>
-          </w:tcPr>
-          <w:p>
-            <w:pPr>
-              <w:jc w:val="center"/>
-            </w:pPr>
-            <w:r>
-              <w:rPr>
-                <w:i/>
-                <w:iCs/>
-                <w:color w:val="6B7280"/>
-                <w:sz w:val="16"/>
-                <w:szCs w:val="16"/>
-              </w:rPr>
-              <w:t xml:space="preserve">Collez votre photo ici</w:t>
-            </w:r>
-          </w:p>
-        </w:tc>
-      </w:tr>
-    </w:tbl>
+      </w:pPr>
+      <w:r>
+        <w:t xml:space="preserve">Ne collez pas vos photos dans ce document. Envoyez 3 photos récentes de vous, seul(e), visage bien visible et sans filtre, directement sur WhatsApp au +237 620 51 41 42, avec la fiche remplie et l'adresse e-mail de votre inscription. Elles restent privées jusqu'à la validation de votre profil.</w:t>
+      </w:r>
+    </w:p>
     <w:p>
       <w:pPr>
         <w:pStyle w:val="Heading2"/>
-        <w:spacing w:after="140" w:before="300"/>
+        <w:spacing w:after="100" w:before="200"/>
       </w:pPr>
       <w:r>
         <w:rPr>
@@ -1279,7 +1059,7 @@
           <w:sz w:val="26"/>
           <w:szCs w:val="26"/>
         </w:rPr>
-        <w:t xml:space="preserve">Ce qui reste à faire par vous-même</w:t>
+        <w:t xml:space="preserve">Et ensuite ?</w:t>
       </w:r>
     </w:p>
     <w:p>
@@ -1295,13 +1075,13 @@
           <w:sz w:val="19"/>
           <w:szCs w:val="19"/>
         </w:rPr>
-        <w:t xml:space="preserve">Pour votre sécurité, l'équipe ne fait jamais à votre place : votre mot de passe, votre selfie de vérification et l'acceptation de la charte. Une fois votre profil complété, connectez-vous sur Garden of Alliance pour choisir votre photo publique.</w:t>
+        <w:t xml:space="preserve">Une fois votre compte créé, un administrateur vous enverra votre mot de passe sur WhatsApp. Vous pourrez le changer depuis « Mot de passe oublié ». Pour votre sécurité, votre selfie de vérification et l'acceptation de la charte restent à faire par vous-même, et vous choisirez votre photo publique à votre première connexion.</w:t>
       </w:r>
     </w:p>
     <w:sectPr>
       <w:footerReference w:type="default" r:id="rId7"/>
       <w:pgSz w:w="11906" w:h="16838" w:orient="portrait"/>
-      <w:pgMar w:top="1134" w:right="1134" w:bottom="1134" w:left="1134" w:header="708" w:footer="708" w:gutter="0"/>
+      <w:pgMar w:top="850" w:right="1134" w:bottom="850" w:left="1134" w:header="708" w:footer="708" w:gutter="0"/>
       <w:pgNumType/>
       <w:docGrid w:linePitch="360"/>
     </w:sectPr>

</xml_diff>

<commit_message>
Fiche d'inscription Word : logo Garden of Alliance
Le monogramme (public/logo.svg) est rendu en PNG haute définition à la
génération et placé en tête de la fiche, avec le nom du site. La fiche
tient toujours sur une page.

Co-Authored-By: Claude Sonnet 5.5 <noreply@anthropic.com>
Claude-Session: https://claude.ai/code/session_01FK7Eey5X6CSAiP16kqVTqg
</commit_message>
<xml_diff>
--- a/public/formulaires/fiche-inscription-garden-of-alliance.docx
+++ b/public/formulaires/fiche-inscription-garden-of-alliance.docx
@@ -2,6 +2,69 @@
 <file path=word/document.xml><?xml version="1.0" encoding="utf-8"?>
 <w:document xmlns:wpc="http://schemas.microsoft.com/office/word/2010/wordprocessingCanvas" xmlns:mc="http://schemas.openxmlformats.org/markup-compatibility/2006" xmlns:o="urn:schemas-microsoft-com:office:office" xmlns:r="http://schemas.openxmlformats.org/officeDocument/2006/relationships" xmlns:m="http://schemas.openxmlformats.org/officeDocument/2006/math" xmlns:v="urn:schemas-microsoft-com:vml" xmlns:wp14="http://schemas.microsoft.com/office/word/2010/wordprocessingDrawing" xmlns:wp="http://schemas.openxmlformats.org/drawingml/2006/wordprocessingDrawing" xmlns:w10="urn:schemas-microsoft-com:office:word" xmlns:w="http://schemas.openxmlformats.org/wordprocessingml/2006/main" xmlns:w14="http://schemas.microsoft.com/office/word/2010/wordml" xmlns:w15="http://schemas.microsoft.com/office/word/2012/wordml" xmlns:wpg="http://schemas.microsoft.com/office/word/2010/wordprocessingGroup" xmlns:wpi="http://schemas.microsoft.com/office/word/2010/wordprocessingInk" xmlns:wne="http://schemas.microsoft.com/office/word/2006/wordml" xmlns:wps="http://schemas.microsoft.com/office/word/2010/wordprocessingShape" xmlns:cx="http://schemas.microsoft.com/office/drawing/2014/chartex" xmlns:cx1="http://schemas.microsoft.com/office/drawing/2015/9/8/chartex" xmlns:cx2="http://schemas.microsoft.com/office/drawing/2015/10/21/chartex" xmlns:cx3="http://schemas.microsoft.com/office/drawing/2016/5/9/chartex" xmlns:cx4="http://schemas.microsoft.com/office/drawing/2016/5/10/chartex" xmlns:cx5="http://schemas.microsoft.com/office/drawing/2016/5/11/chartex" xmlns:cx6="http://schemas.microsoft.com/office/drawing/2016/5/12/chartex" xmlns:cx7="http://schemas.microsoft.com/office/drawing/2016/5/13/chartex" xmlns:cx8="http://schemas.microsoft.com/office/drawing/2016/5/14/chartex" xmlns:aink="http://schemas.microsoft.com/office/drawing/2016/ink" xmlns:am3d="http://schemas.microsoft.com/office/drawing/2017/model3d" xmlns:w16cex="http://schemas.microsoft.com/office/word/2018/wordml/cex" xmlns:w16cid="http://schemas.microsoft.com/office/word/2016/wordml/cid" xmlns:w16="http://schemas.microsoft.com/office/word/2018/wordml" xmlns:w16sdtdh="http://schemas.microsoft.com/office/word/2020/wordml/sdtdatahash" xmlns:w16se="http://schemas.microsoft.com/office/word/2015/wordml/symex" mc:Ignorable="w14 w15 wp14">
   <w:body>
+    <w:p>
+      <w:pPr>
+        <w:spacing w:after="60"/>
+        <w:jc w:val="center"/>
+      </w:pPr>
+      <w:r>
+        <w:drawing>
+          <wp:inline distT="0" distB="0" distL="0" distR="0">
+            <wp:extent cx="533400" cy="457200"/>
+            <wp:effectExtent t="0" r="0" b="0" l="0"/>
+            <wp:docPr id="1" name="logo" descr="Logo Garden of Alliance" title="Garden of Alliance"/>
+            <wp:cNvGraphicFramePr>
+              <a:graphicFrameLocks xmlns:a="http://schemas.openxmlformats.org/drawingml/2006/main" noChangeAspect="1"/>
+            </wp:cNvGraphicFramePr>
+            <a:graphic xmlns:a="http://schemas.openxmlformats.org/drawingml/2006/main">
+              <a:graphicData uri="http://schemas.openxmlformats.org/drawingml/2006/picture">
+                <pic:pic xmlns:pic="http://schemas.openxmlformats.org/drawingml/2006/picture">
+                  <pic:nvPicPr>
+                    <pic:cNvPr id="0" name="" descr=""/>
+                    <pic:cNvPicPr>
+                      <a:picLocks noChangeAspect="1" noChangeArrowheads="1"/>
+                    </pic:cNvPicPr>
+                  </pic:nvPicPr>
+                  <pic:blipFill>
+                    <a:blip r:embed="rId8" cstate="none"/>
+                    <a:srcRect/>
+                    <a:stretch>
+                      <a:fillRect/>
+                    </a:stretch>
+                  </pic:blipFill>
+                  <pic:spPr bwMode="auto">
+                    <a:xfrm>
+                      <a:off x="0" y="0"/>
+                      <a:ext cx="533400" cy="457200"/>
+                    </a:xfrm>
+                    <a:prstGeom prst="rect">
+                      <a:avLst/>
+                    </a:prstGeom>
+                  </pic:spPr>
+                </pic:pic>
+              </a:graphicData>
+            </a:graphic>
+          </wp:inline>
+        </w:drawing>
+      </w:r>
+    </w:p>
+    <w:p>
+      <w:pPr>
+        <w:spacing w:after="20"/>
+        <w:jc w:val="center"/>
+      </w:pPr>
+      <w:r>
+        <w:rPr>
+          <w:b/>
+          <w:bCs/>
+          <w:color w:val="486B46"/>
+          <w:spacing w:val="60"/>
+          <w:sz w:val="22"/>
+          <w:szCs w:val="22"/>
+        </w:rPr>
+        <w:t xml:space="preserve">GARDEN OF ALLIANCE</w:t>
+      </w:r>
+    </w:p>
     <w:p>
       <w:pPr>
         <w:pStyle w:val="Heading1"/>
@@ -86,7 +149,7 @@
     <w:p>
       <w:pPr>
         <w:pStyle w:val="Heading2"/>
-        <w:spacing w:after="100" w:before="200"/>
+        <w:spacing w:after="80" w:before="140"/>
       </w:pPr>
       <w:r>
         <w:rPr>
@@ -127,9 +190,9 @@
             </w:tcBorders>
             <w:shd w:fill="EEF3EC" w:color="auto" w:val="clear"/>
             <w:tcMar>
-              <w:top w:type="dxa" w:w="70"/>
-              <w:left w:type="dxa" w:w="140"/>
-              <w:bottom w:type="dxa" w:w="70"/>
+              <w:top w:type="dxa" w:w="55"/>
+              <w:left w:type="dxa" w:w="140"/>
+              <w:bottom w:type="dxa" w:w="55"/>
               <w:right w:type="dxa" w:w="140"/>
             </w:tcMar>
             <w:vAlign w:val="center"/>
@@ -169,9 +232,9 @@
               <w:right w:val="single" w:color="C9D3C7" w:sz="4"/>
             </w:tcBorders>
             <w:tcMar>
-              <w:top w:type="dxa" w:w="70"/>
-              <w:left w:type="dxa" w:w="140"/>
-              <w:bottom w:type="dxa" w:w="70"/>
+              <w:top w:type="dxa" w:w="55"/>
+              <w:left w:type="dxa" w:w="140"/>
+              <w:bottom w:type="dxa" w:w="55"/>
               <w:right w:type="dxa" w:w="140"/>
             </w:tcMar>
             <w:vAlign w:val="center"/>
@@ -191,7 +254,7 @@
     <w:p>
       <w:pPr>
         <w:pStyle w:val="Heading2"/>
-        <w:spacing w:after="100" w:before="200"/>
+        <w:spacing w:after="80" w:before="140"/>
       </w:pPr>
       <w:r>
         <w:rPr>
@@ -232,9 +295,9 @@
             </w:tcBorders>
             <w:shd w:fill="EEF3EC" w:color="auto" w:val="clear"/>
             <w:tcMar>
-              <w:top w:type="dxa" w:w="70"/>
-              <w:left w:type="dxa" w:w="140"/>
-              <w:bottom w:type="dxa" w:w="70"/>
+              <w:top w:type="dxa" w:w="55"/>
+              <w:left w:type="dxa" w:w="140"/>
+              <w:bottom w:type="dxa" w:w="55"/>
               <w:right w:type="dxa" w:w="140"/>
             </w:tcMar>
             <w:vAlign w:val="center"/>
@@ -274,9 +337,9 @@
               <w:right w:val="single" w:color="C9D3C7" w:sz="4"/>
             </w:tcBorders>
             <w:tcMar>
-              <w:top w:type="dxa" w:w="70"/>
-              <w:left w:type="dxa" w:w="140"/>
-              <w:bottom w:type="dxa" w:w="70"/>
+              <w:top w:type="dxa" w:w="55"/>
+              <w:left w:type="dxa" w:w="140"/>
+              <w:bottom w:type="dxa" w:w="55"/>
               <w:right w:type="dxa" w:w="140"/>
             </w:tcMar>
             <w:vAlign w:val="center"/>
@@ -304,9 +367,9 @@
             </w:tcBorders>
             <w:shd w:fill="EEF3EC" w:color="auto" w:val="clear"/>
             <w:tcMar>
-              <w:top w:type="dxa" w:w="70"/>
-              <w:left w:type="dxa" w:w="140"/>
-              <w:bottom w:type="dxa" w:w="70"/>
+              <w:top w:type="dxa" w:w="55"/>
+              <w:left w:type="dxa" w:w="140"/>
+              <w:bottom w:type="dxa" w:w="55"/>
               <w:right w:type="dxa" w:w="140"/>
             </w:tcMar>
             <w:vAlign w:val="center"/>
@@ -334,9 +397,9 @@
               <w:right w:val="single" w:color="C9D3C7" w:sz="4"/>
             </w:tcBorders>
             <w:tcMar>
-              <w:top w:type="dxa" w:w="70"/>
-              <w:left w:type="dxa" w:w="140"/>
-              <w:bottom w:type="dxa" w:w="70"/>
+              <w:top w:type="dxa" w:w="55"/>
+              <w:left w:type="dxa" w:w="140"/>
+              <w:bottom w:type="dxa" w:w="55"/>
               <w:right w:type="dxa" w:w="140"/>
             </w:tcMar>
             <w:vAlign w:val="center"/>
@@ -364,9 +427,9 @@
             </w:tcBorders>
             <w:shd w:fill="EEF3EC" w:color="auto" w:val="clear"/>
             <w:tcMar>
-              <w:top w:type="dxa" w:w="70"/>
-              <w:left w:type="dxa" w:w="140"/>
-              <w:bottom w:type="dxa" w:w="70"/>
+              <w:top w:type="dxa" w:w="55"/>
+              <w:left w:type="dxa" w:w="140"/>
+              <w:bottom w:type="dxa" w:w="55"/>
               <w:right w:type="dxa" w:w="140"/>
             </w:tcMar>
             <w:vAlign w:val="center"/>
@@ -394,9 +457,9 @@
               <w:right w:val="single" w:color="C9D3C7" w:sz="4"/>
             </w:tcBorders>
             <w:tcMar>
-              <w:top w:type="dxa" w:w="70"/>
-              <w:left w:type="dxa" w:w="140"/>
-              <w:bottom w:type="dxa" w:w="70"/>
+              <w:top w:type="dxa" w:w="55"/>
+              <w:left w:type="dxa" w:w="140"/>
+              <w:bottom w:type="dxa" w:w="55"/>
               <w:right w:type="dxa" w:w="140"/>
             </w:tcMar>
             <w:vAlign w:val="center"/>
@@ -424,9 +487,9 @@
             </w:tcBorders>
             <w:shd w:fill="EEF3EC" w:color="auto" w:val="clear"/>
             <w:tcMar>
-              <w:top w:type="dxa" w:w="70"/>
-              <w:left w:type="dxa" w:w="140"/>
-              <w:bottom w:type="dxa" w:w="70"/>
+              <w:top w:type="dxa" w:w="55"/>
+              <w:left w:type="dxa" w:w="140"/>
+              <w:bottom w:type="dxa" w:w="55"/>
               <w:right w:type="dxa" w:w="140"/>
             </w:tcMar>
             <w:vAlign w:val="center"/>
@@ -466,9 +529,9 @@
               <w:right w:val="single" w:color="C9D3C7" w:sz="4"/>
             </w:tcBorders>
             <w:tcMar>
-              <w:top w:type="dxa" w:w="70"/>
-              <w:left w:type="dxa" w:w="140"/>
-              <w:bottom w:type="dxa" w:w="70"/>
+              <w:top w:type="dxa" w:w="55"/>
+              <w:left w:type="dxa" w:w="140"/>
+              <w:bottom w:type="dxa" w:w="55"/>
               <w:right w:type="dxa" w:w="140"/>
             </w:tcMar>
             <w:vAlign w:val="center"/>
@@ -496,9 +559,9 @@
             </w:tcBorders>
             <w:shd w:fill="EEF3EC" w:color="auto" w:val="clear"/>
             <w:tcMar>
-              <w:top w:type="dxa" w:w="70"/>
-              <w:left w:type="dxa" w:w="140"/>
-              <w:bottom w:type="dxa" w:w="70"/>
+              <w:top w:type="dxa" w:w="55"/>
+              <w:left w:type="dxa" w:w="140"/>
+              <w:bottom w:type="dxa" w:w="55"/>
               <w:right w:type="dxa" w:w="140"/>
             </w:tcMar>
             <w:vAlign w:val="center"/>
@@ -538,9 +601,9 @@
               <w:right w:val="single" w:color="C9D3C7" w:sz="4"/>
             </w:tcBorders>
             <w:tcMar>
-              <w:top w:type="dxa" w:w="70"/>
-              <w:left w:type="dxa" w:w="140"/>
-              <w:bottom w:type="dxa" w:w="70"/>
+              <w:top w:type="dxa" w:w="55"/>
+              <w:left w:type="dxa" w:w="140"/>
+              <w:bottom w:type="dxa" w:w="55"/>
               <w:right w:type="dxa" w:w="140"/>
             </w:tcMar>
             <w:vAlign w:val="center"/>
@@ -568,9 +631,9 @@
             </w:tcBorders>
             <w:shd w:fill="EEF3EC" w:color="auto" w:val="clear"/>
             <w:tcMar>
-              <w:top w:type="dxa" w:w="70"/>
-              <w:left w:type="dxa" w:w="140"/>
-              <w:bottom w:type="dxa" w:w="70"/>
+              <w:top w:type="dxa" w:w="55"/>
+              <w:left w:type="dxa" w:w="140"/>
+              <w:bottom w:type="dxa" w:w="55"/>
               <w:right w:type="dxa" w:w="140"/>
             </w:tcMar>
             <w:vAlign w:val="center"/>
@@ -610,9 +673,9 @@
               <w:right w:val="single" w:color="C9D3C7" w:sz="4"/>
             </w:tcBorders>
             <w:tcMar>
-              <w:top w:type="dxa" w:w="70"/>
-              <w:left w:type="dxa" w:w="140"/>
-              <w:bottom w:type="dxa" w:w="70"/>
+              <w:top w:type="dxa" w:w="55"/>
+              <w:left w:type="dxa" w:w="140"/>
+              <w:bottom w:type="dxa" w:w="55"/>
               <w:right w:type="dxa" w:w="140"/>
             </w:tcMar>
             <w:vAlign w:val="center"/>
@@ -632,7 +695,7 @@
     <w:p>
       <w:pPr>
         <w:pStyle w:val="Heading2"/>
-        <w:spacing w:after="100" w:before="200"/>
+        <w:spacing w:after="80" w:before="140"/>
       </w:pPr>
       <w:r>
         <w:rPr>
@@ -673,9 +736,9 @@
             </w:tcBorders>
             <w:shd w:fill="EEF3EC" w:color="auto" w:val="clear"/>
             <w:tcMar>
-              <w:top w:type="dxa" w:w="70"/>
-              <w:left w:type="dxa" w:w="140"/>
-              <w:bottom w:type="dxa" w:w="70"/>
+              <w:top w:type="dxa" w:w="55"/>
+              <w:left w:type="dxa" w:w="140"/>
+              <w:bottom w:type="dxa" w:w="55"/>
               <w:right w:type="dxa" w:w="140"/>
             </w:tcMar>
             <w:vAlign w:val="center"/>
@@ -715,9 +778,9 @@
               <w:right w:val="single" w:color="C9D3C7" w:sz="4"/>
             </w:tcBorders>
             <w:tcMar>
-              <w:top w:type="dxa" w:w="70"/>
-              <w:left w:type="dxa" w:w="140"/>
-              <w:bottom w:type="dxa" w:w="70"/>
+              <w:top w:type="dxa" w:w="55"/>
+              <w:left w:type="dxa" w:w="140"/>
+              <w:bottom w:type="dxa" w:w="55"/>
               <w:right w:type="dxa" w:w="140"/>
             </w:tcMar>
             <w:vAlign w:val="center"/>
@@ -745,9 +808,9 @@
             </w:tcBorders>
             <w:shd w:fill="EEF3EC" w:color="auto" w:val="clear"/>
             <w:tcMar>
-              <w:top w:type="dxa" w:w="70"/>
-              <w:left w:type="dxa" w:w="140"/>
-              <w:bottom w:type="dxa" w:w="70"/>
+              <w:top w:type="dxa" w:w="55"/>
+              <w:left w:type="dxa" w:w="140"/>
+              <w:bottom w:type="dxa" w:w="55"/>
               <w:right w:type="dxa" w:w="140"/>
             </w:tcMar>
             <w:vAlign w:val="center"/>
@@ -787,9 +850,9 @@
               <w:right w:val="single" w:color="C9D3C7" w:sz="4"/>
             </w:tcBorders>
             <w:tcMar>
-              <w:top w:type="dxa" w:w="70"/>
-              <w:left w:type="dxa" w:w="140"/>
-              <w:bottom w:type="dxa" w:w="70"/>
+              <w:top w:type="dxa" w:w="55"/>
+              <w:left w:type="dxa" w:w="140"/>
+              <w:bottom w:type="dxa" w:w="55"/>
               <w:right w:type="dxa" w:w="140"/>
             </w:tcMar>
             <w:vAlign w:val="center"/>
@@ -817,9 +880,9 @@
             </w:tcBorders>
             <w:shd w:fill="EEF3EC" w:color="auto" w:val="clear"/>
             <w:tcMar>
-              <w:top w:type="dxa" w:w="70"/>
-              <w:left w:type="dxa" w:w="140"/>
-              <w:bottom w:type="dxa" w:w="70"/>
+              <w:top w:type="dxa" w:w="55"/>
+              <w:left w:type="dxa" w:w="140"/>
+              <w:bottom w:type="dxa" w:w="55"/>
               <w:right w:type="dxa" w:w="140"/>
             </w:tcMar>
             <w:vAlign w:val="center"/>
@@ -859,9 +922,9 @@
               <w:right w:val="single" w:color="C9D3C7" w:sz="4"/>
             </w:tcBorders>
             <w:tcMar>
-              <w:top w:type="dxa" w:w="70"/>
-              <w:left w:type="dxa" w:w="140"/>
-              <w:bottom w:type="dxa" w:w="70"/>
+              <w:top w:type="dxa" w:w="55"/>
+              <w:left w:type="dxa" w:w="140"/>
+              <w:bottom w:type="dxa" w:w="55"/>
               <w:right w:type="dxa" w:w="140"/>
             </w:tcMar>
             <w:vAlign w:val="center"/>
@@ -889,9 +952,9 @@
             </w:tcBorders>
             <w:shd w:fill="EEF3EC" w:color="auto" w:val="clear"/>
             <w:tcMar>
-              <w:top w:type="dxa" w:w="70"/>
-              <w:left w:type="dxa" w:w="140"/>
-              <w:bottom w:type="dxa" w:w="70"/>
+              <w:top w:type="dxa" w:w="55"/>
+              <w:left w:type="dxa" w:w="140"/>
+              <w:bottom w:type="dxa" w:w="55"/>
               <w:right w:type="dxa" w:w="140"/>
             </w:tcMar>
             <w:vAlign w:val="center"/>
@@ -931,9 +994,9 @@
               <w:right w:val="single" w:color="C9D3C7" w:sz="4"/>
             </w:tcBorders>
             <w:tcMar>
-              <w:top w:type="dxa" w:w="70"/>
-              <w:left w:type="dxa" w:w="140"/>
-              <w:bottom w:type="dxa" w:w="70"/>
+              <w:top w:type="dxa" w:w="55"/>
+              <w:left w:type="dxa" w:w="140"/>
+              <w:bottom w:type="dxa" w:w="55"/>
               <w:right w:type="dxa" w:w="140"/>
             </w:tcMar>
             <w:vAlign w:val="center"/>
@@ -961,9 +1024,9 @@
             </w:tcBorders>
             <w:shd w:fill="EEF3EC" w:color="auto" w:val="clear"/>
             <w:tcMar>
-              <w:top w:type="dxa" w:w="70"/>
-              <w:left w:type="dxa" w:w="140"/>
-              <w:bottom w:type="dxa" w:w="70"/>
+              <w:top w:type="dxa" w:w="55"/>
+              <w:left w:type="dxa" w:w="140"/>
+              <w:bottom w:type="dxa" w:w="55"/>
               <w:right w:type="dxa" w:w="140"/>
             </w:tcMar>
             <w:vAlign w:val="center"/>
@@ -1003,9 +1066,9 @@
               <w:right w:val="single" w:color="C9D3C7" w:sz="4"/>
             </w:tcBorders>
             <w:tcMar>
-              <w:top w:type="dxa" w:w="70"/>
-              <w:left w:type="dxa" w:w="140"/>
-              <w:bottom w:type="dxa" w:w="70"/>
+              <w:top w:type="dxa" w:w="55"/>
+              <w:left w:type="dxa" w:w="140"/>
+              <w:bottom w:type="dxa" w:w="55"/>
               <w:right w:type="dxa" w:w="140"/>
             </w:tcMar>
             <w:vAlign w:val="center"/>
@@ -1025,7 +1088,7 @@
     <w:p>
       <w:pPr>
         <w:pStyle w:val="Heading2"/>
-        <w:spacing w:after="100" w:before="200"/>
+        <w:spacing w:after="80" w:before="140"/>
       </w:pPr>
       <w:r>
         <w:rPr>
@@ -1049,7 +1112,7 @@
     <w:p>
       <w:pPr>
         <w:pStyle w:val="Heading2"/>
-        <w:spacing w:after="100" w:before="200"/>
+        <w:spacing w:after="80" w:before="140"/>
       </w:pPr>
       <w:r>
         <w:rPr>
@@ -1081,7 +1144,7 @@
     <w:sectPr>
       <w:footerReference w:type="default" r:id="rId7"/>
       <w:pgSz w:w="11906" w:h="16838" w:orient="portrait"/>
-      <w:pgMar w:top="850" w:right="1134" w:bottom="850" w:left="1134" w:header="708" w:footer="708" w:gutter="0"/>
+      <w:pgMar w:top="600" w:right="1134" w:bottom="600" w:left="1134" w:header="708" w:footer="708" w:gutter="0"/>
       <w:pgNumType/>
       <w:docGrid w:linePitch="360"/>
     </w:sectPr>

</xml_diff>